<commit_message>
Rick e Renner: revisão da Parte 3
Co-Authored-By: Claude Opus 5.5 <noreply@anthropic.com>
Claude-Session: https://claude.ai/code/session_01MJjUEEZrxQDEUifKK2vj9g
</commit_message>
<xml_diff>
--- a/roteiros/rick-e-renner/RickRenner_Parte3.docx
+++ b/roteiros/rick-e-renner/RickRenner_Parte3.docx
@@ -199,7 +199,7 @@
         <w:rPr>
           <w:color w:val="000000"/>
         </w:rPr>
-        <w:t>As músicas continuavam tocando. A dupla continuava lotando shows.</w:t>
+        <w:t>As músicas continuavam tocando. A dupla seguia fazendo shows pelo país.</w:t>
       </w:r>
     </w:p>
     <w:p>
@@ -263,7 +263,7 @@
         <w:rPr>
           <w:color w:val="000000"/>
         </w:rPr>
-        <w:t>Só que a campanha teve um efeito colateral. Renner começou a faltar a shows da dupla.</w:t>
+        <w:t>Ao mesmo tempo, Renner começou a faltar a shows da dupla.</w:t>
       </w:r>
     </w:p>
     <w:p>
@@ -303,7 +303,7 @@
         <w:rPr>
           <w:color w:val="000000"/>
         </w:rPr>
-        <w:t>No dia da votação, mesmo sem fazer campanha, Renner recebeu setenta e seis mil, quatrocentos e dez votos. Ficou longe de ser eleito.</w:t>
+        <w:t>No dia da votação, mesmo depois de ter desistido, Renner recebeu setenta e seis mil, quatrocentos e dez votos. Ficou longe de ser eleito.</w:t>
       </w:r>
     </w:p>
     <w:p>
@@ -351,7 +351,7 @@
         <w:rPr>
           <w:color w:val="000000"/>
         </w:rPr>
-        <w:t>Na época, a explicação oficial falou em diferenças criativas e problemas pessoais.</w:t>
+        <w:t>Na época, falou-se em diferenças criativas e problemas pessoais.</w:t>
       </w:r>
     </w:p>
     <w:p>
@@ -383,7 +383,7 @@
         <w:rPr>
           <w:color w:val="C00000"/>
         </w:rPr>
-        <w:t>Os dois ficaram cerca de um ano e meio separados. E, quando decidiram voltar, ninguém imaginava que o pior ainda estava por vir. Porque a noite que quase acabou com Renner de vez ainda não tinha acontecido.</w:t>
+        <w:t>Os dois ficaram quase dois anos separados. E, quando decidiram voltar, ninguém imaginava que o pior ainda estava por vir. Porque a noite que quase acabou com Renner de vez ainda não tinha acontecido.</w:t>
       </w:r>
     </w:p>
     <w:sectPr>

</xml_diff>